<commit_message>
created files for Echo lletter and grade proposal - need to be changed
Signed-off-by: Rishabh Agarwal <agarwalrishabh2005@gmail.com>
</commit_message>
<xml_diff>
--- a/Iteration_2/Echo_Review/final_submission/Echo_Letter.docx
+++ b/Iteration_2/Echo_Review/final_submission/Echo_Letter.docx
@@ -51,14 +51,7 @@
           <w:sz w:val="24"/>
           <w:szCs w:val="24"/>
         </w:rPr>
-        <w:t xml:space="preserve">We think that </w:t>
-      </w:r>
-      <w:r>
-        <w:rPr>
-          <w:sz w:val="24"/>
-          <w:szCs w:val="24"/>
-        </w:rPr>
-        <w:t>overall,</w:t>
+        <w:t>We think that overall,</w:t>
       </w:r>
       <w:r>
         <w:rPr>
@@ -136,21 +129,7 @@
           <w:sz w:val="24"/>
           <w:szCs w:val="24"/>
         </w:rPr>
-        <w:t xml:space="preserve"> there were identical classes that led us to backtrack a lot to understand what was happening. Albeit</w:t>
-      </w:r>
-      <w:r>
-        <w:rPr>
-          <w:sz w:val="24"/>
-          <w:szCs w:val="24"/>
-        </w:rPr>
-        <w:t xml:space="preserve"> we were impressed by the detail for the network planning</w:t>
-      </w:r>
-      <w:r>
-        <w:rPr>
-          <w:sz w:val="24"/>
-          <w:szCs w:val="24"/>
-        </w:rPr>
-        <w:t>, collectively describing “Networking” in the class diagram didn’t do justice to the effort you put in the planning</w:t>
+        <w:t xml:space="preserve"> there were identical classes that led us to backtrack a lot to understand what was happening. Albeit we were impressed by the detail for the network planning, collectively describing “Networking” in the class diagram didn’t do justice to the effort you put in the planning</w:t>
       </w:r>
       <w:r>
         <w:rPr>
@@ -214,9 +193,22 @@
         <w:rPr>
           <w:sz w:val="24"/>
           <w:szCs w:val="24"/>
-          <w:highlight w:val="yellow"/>
-        </w:rPr>
-        <w:t>Your use cases are comprehensive, detailed, and touch on the most important aspects of the project.</w:t>
+        </w:rPr>
+        <w:t xml:space="preserve">Your use cases </w:t>
+      </w:r>
+      <w:r>
+        <w:rPr>
+          <w:sz w:val="24"/>
+          <w:szCs w:val="24"/>
+        </w:rPr>
+        <w:t>were</w:t>
+      </w:r>
+      <w:r>
+        <w:rPr>
+          <w:sz w:val="24"/>
+          <w:szCs w:val="24"/>
+        </w:rPr>
+        <w:t xml:space="preserve"> comprehensive, detailed, and touch on the most important aspects of the project.</w:t>
       </w:r>
       <w:r>
         <w:rPr>
@@ -224,6 +216,13 @@
           <w:szCs w:val="24"/>
         </w:rPr>
         <w:t xml:space="preserve"> </w:t>
+      </w:r>
+      <w:r>
+        <w:rPr>
+          <w:sz w:val="24"/>
+          <w:szCs w:val="24"/>
+        </w:rPr>
+        <w:t>However, some of the diagrams had incorrect flow lines with the relationship between use cases incorrect. Additionally, some use cases were missing essential components like open issues, priority and channels to secondary actors.</w:t>
       </w:r>
     </w:p>
     <w:p>
@@ -294,16 +293,29 @@
         <w:rPr>
           <w:sz w:val="24"/>
           <w:szCs w:val="24"/>
-          <w:highlight w:val="yellow"/>
-        </w:rPr>
-        <w:t>Your project structure is strong, and we mainly had suggestions for improvement. While your class diagrams are well designed, some minor errors like naming consistencies and incorrect relationships may lead to confusion in the future.</w:t>
-      </w:r>
-      <w:r>
-        <w:rPr>
-          <w:sz w:val="24"/>
-          <w:szCs w:val="24"/>
-        </w:rPr>
-        <w:t xml:space="preserve"> </w:t>
+        </w:rPr>
+        <w:t xml:space="preserve">Your project structure is </w:t>
+      </w:r>
+      <w:r>
+        <w:rPr>
+          <w:sz w:val="24"/>
+          <w:szCs w:val="24"/>
+        </w:rPr>
+        <w:t>not very strong especially because of the over emphasis on the networking side</w:t>
+      </w:r>
+      <w:r>
+        <w:rPr>
+          <w:sz w:val="24"/>
+          <w:szCs w:val="24"/>
+        </w:rPr>
+        <w:t xml:space="preserve">, and we </w:t>
+      </w:r>
+      <w:r>
+        <w:rPr>
+          <w:sz w:val="24"/>
+          <w:szCs w:val="24"/>
+        </w:rPr>
+        <w:t>have made some good suggestions for those documents as well.</w:t>
       </w:r>
     </w:p>
     <w:p>
@@ -313,6 +325,13 @@
           <w:szCs w:val="24"/>
         </w:rPr>
       </w:pPr>
+      <w:r>
+        <w:rPr>
+          <w:sz w:val="24"/>
+          <w:szCs w:val="24"/>
+        </w:rPr>
+        <w:t xml:space="preserve">We would encourage you to take this feedback positively and dedicate a bit more tome considering the requirements of the project and how backend and frontend can be more inherently described. </w:t>
+      </w:r>
     </w:p>
     <w:p>
       <w:pPr>
@@ -328,14 +347,6 @@
         </w:rPr>
         <w:t>For our detailed corrections and changes, please refer to the annotated feedback document.</w:t>
       </w:r>
-    </w:p>
-    <w:p>
-      <w:pPr>
-        <w:rPr>
-          <w:sz w:val="24"/>
-          <w:szCs w:val="24"/>
-        </w:rPr>
-      </w:pPr>
     </w:p>
     <w:p>
       <w:pPr>
@@ -965,6 +976,7 @@
   <w:style w:type="character" w:default="1" w:styleId="DefaultParagraphFont">
     <w:name w:val="Default Paragraph Font"/>
     <w:uiPriority w:val="1"/>
+    <w:semiHidden/>
     <w:unhideWhenUsed/>
   </w:style>
   <w:style w:type="table" w:default="1" w:styleId="TableNormal">

</xml_diff>

<commit_message>
updated files with the use cases - done in previous commit but message was copied by mistake
Signed-off-by: Rishabh Agarwal <agarwalrishabh2005@gmail.com>
</commit_message>
<xml_diff>
--- a/Iteration_2/Echo_Review/final_submission/Echo_Letter.docx
+++ b/Iteration_2/Echo_Review/final_submission/Echo_Letter.docx
@@ -347,6 +347,14 @@
         </w:rPr>
         <w:t>For our detailed corrections and changes, please refer to the annotated feedback document.</w:t>
       </w:r>
+    </w:p>
+    <w:p>
+      <w:pPr>
+        <w:rPr>
+          <w:sz w:val="24"/>
+          <w:szCs w:val="24"/>
+        </w:rPr>
+      </w:pPr>
     </w:p>
     <w:p>
       <w:pPr>

</xml_diff>

<commit_message>
fixed grammar errors and spelling mistakes in the letter
Signed-off-by: Rishabh Agarwal <agarwalrishabh2005@gmail.com>
</commit_message>
<xml_diff>
--- a/Iteration_2/Echo_Review/final_submission/Echo_Letter.docx
+++ b/Iteration_2/Echo_Review/final_submission/Echo_Letter.docx
@@ -179,7 +179,7 @@
           <w:sz w:val="24"/>
           <w:szCs w:val="24"/>
         </w:rPr>
-        <w:t xml:space="preserve">Even though the sequence diagram was not requested, you do present a simplified version of the networking, which we thought required more thought. Instead of a single loop, a single ton class can better achieve the same task. Additionally, the parallelization was not appropriate since it requires an input.  </w:t>
+        <w:t xml:space="preserve">Even though the sequence diagram was not requested, you do present a simplified version of the networking, which we thought required more thought. Instead of a single loop, a singleton class can better achieve the same task. Additionally, the parallelization was not appropriate since it requires an input.  </w:t>
       </w:r>
     </w:p>
     <w:p>
@@ -222,7 +222,7 @@
           <w:sz w:val="24"/>
           <w:szCs w:val="24"/>
         </w:rPr>
-        <w:t>However, some of the diagrams had incorrect flow lines with the relationship between use cases incorrect. Additionally, some use cases were missing essential components like open issues, priority and channels to secondary actors.</w:t>
+        <w:t>However, some of the diagrams had incorrect flow lines with the relationship between use cases. Additionally, some use cases were missing essential components like open issues, priority and channels to secondary actors.</w:t>
       </w:r>
     </w:p>
     <w:p>
@@ -330,7 +330,21 @@
           <w:sz w:val="24"/>
           <w:szCs w:val="24"/>
         </w:rPr>
-        <w:t xml:space="preserve">We would encourage you to take this feedback positively and dedicate a bit more tome considering the requirements of the project and how backend and frontend can be more inherently described. </w:t>
+        <w:t>We would encourage you to take this feedback positively and dedicate a bit more t</w:t>
+      </w:r>
+      <w:r>
+        <w:rPr>
+          <w:sz w:val="24"/>
+          <w:szCs w:val="24"/>
+        </w:rPr>
+        <w:t>i</w:t>
+      </w:r>
+      <w:r>
+        <w:rPr>
+          <w:sz w:val="24"/>
+          <w:szCs w:val="24"/>
+        </w:rPr>
+        <w:t xml:space="preserve">me considering the requirements of the project and how backend and frontend can be more inherently described. </w:t>
       </w:r>
     </w:p>
     <w:p>

</xml_diff>